<commit_message>
style: address cover letter to the Editor-in-Chief
</commit_message>
<xml_diff>
--- a/cover_letter_statistics_in_medicine.docx
+++ b/cover_letter_statistics_in_medicine.docx
@@ -9,7 +9,7 @@
     </w:p>
     <w:p>
       <w:r>
-        <w:t>The Editors</w:t>
+        <w:t>The Editor-in-Chief</w:t>
       </w:r>
     </w:p>
     <w:p>
@@ -24,7 +24,7 @@
     </w:p>
     <w:p>
       <w:r>
-        <w:t>Dear Editors,</w:t>
+        <w:t>Dear Editor-in-Chief,</w:t>
       </w:r>
     </w:p>
     <w:p>

</xml_diff>

<commit_message>
style: address cover letter to The Editors-in-Chief
</commit_message>
<xml_diff>
--- a/cover_letter_statistics_in_medicine.docx
+++ b/cover_letter_statistics_in_medicine.docx
@@ -9,7 +9,7 @@
     </w:p>
     <w:p>
       <w:r>
-        <w:t>The Editor-in-Chief</w:t>
+        <w:t>The Editors-in-Chief</w:t>
       </w:r>
     </w:p>
     <w:p>
@@ -24,7 +24,7 @@
     </w:p>
     <w:p>
       <w:r>
-        <w:t>Dear Editor-in-Chief,</w:t>
+        <w:t>Dear Editors-in-Chief,</w:t>
       </w:r>
     </w:p>
     <w:p>

</xml_diff>